<commit_message>
Expand PMO frontend workflows and detail pages.
Add issue/risk/change request detail and register views, extend app routing and API endpoints, and update auth/app shell/type definitions to support the new operational modules.

Co-authored-by: Cursor <cursoragent@cursor.com>
</commit_message>
<xml_diff>
--- a/ui prompt.docx
+++ b/ui prompt.docx
@@ -295,7 +295,7 @@
     <w:p>
       <w:r>
         <w:pict w14:anchorId="16B3AE33">
-          <v:rect id="_x0000_i1121" style="width:0;height:1.5pt" o:hralign="center" o:hrstd="t" o:hr="t" fillcolor="#a0a0a0" stroked="f"/>
+          <v:rect id="_x0000_i1025" style="width:0;height:1.5pt" o:hralign="center" o:hrstd="t" o:hr="t" fillcolor="#a0a0a0" stroked="f"/>
         </w:pict>
       </w:r>
     </w:p>
@@ -534,7 +534,7 @@
     <w:p>
       <w:r>
         <w:pict w14:anchorId="062E8A56">
-          <v:rect id="_x0000_i1122" style="width:0;height:1.5pt" o:hralign="center" o:hrstd="t" o:hr="t" fillcolor="#a0a0a0" stroked="f"/>
+          <v:rect id="_x0000_i1026" style="width:0;height:1.5pt" o:hralign="center" o:hrstd="t" o:hr="t" fillcolor="#a0a0a0" stroked="f"/>
         </w:pict>
       </w:r>
     </w:p>
@@ -695,7 +695,7 @@
       <w:r>
         <w:lastRenderedPageBreak/>
         <w:pict w14:anchorId="427DB45F">
-          <v:rect id="_x0000_i1123" style="width:0;height:1.5pt" o:hralign="center" o:hrstd="t" o:hr="t" fillcolor="#a0a0a0" stroked="f"/>
+          <v:rect id="_x0000_i1027" style="width:0;height:1.5pt" o:hralign="center" o:hrstd="t" o:hr="t" fillcolor="#a0a0a0" stroked="f"/>
         </w:pict>
       </w:r>
     </w:p>
@@ -730,7 +730,7 @@
     <w:p>
       <w:r>
         <w:pict w14:anchorId="6B7D8404">
-          <v:rect id="_x0000_i1124" style="width:0;height:1.5pt" o:hralign="center" o:hrstd="t" o:hr="t" fillcolor="#a0a0a0" stroked="f"/>
+          <v:rect id="_x0000_i1028" style="width:0;height:1.5pt" o:hralign="center" o:hrstd="t" o:hr="t" fillcolor="#a0a0a0" stroked="f"/>
         </w:pict>
       </w:r>
     </w:p>
@@ -1482,7 +1482,7 @@
     <w:p>
       <w:r>
         <w:pict w14:anchorId="493E6FAF">
-          <v:rect id="_x0000_i1125" style="width:0;height:1.5pt" o:hralign="center" o:hrstd="t" o:hr="t" fillcolor="#a0a0a0" stroked="f"/>
+          <v:rect id="_x0000_i1029" style="width:0;height:1.5pt" o:hralign="center" o:hrstd="t" o:hr="t" fillcolor="#a0a0a0" stroked="f"/>
         </w:pict>
       </w:r>
     </w:p>
@@ -2218,7 +2218,7 @@
     <w:p>
       <w:r>
         <w:pict w14:anchorId="7B4F6B81">
-          <v:rect id="_x0000_i1126" style="width:0;height:1.5pt" o:hralign="center" o:hrstd="t" o:hr="t" fillcolor="#a0a0a0" stroked="f"/>
+          <v:rect id="_x0000_i1030" style="width:0;height:1.5pt" o:hralign="center" o:hrstd="t" o:hr="t" fillcolor="#a0a0a0" stroked="f"/>
         </w:pict>
       </w:r>
     </w:p>
@@ -2836,7 +2836,7 @@
           <w:highlight w:val="yellow"/>
         </w:rPr>
         <w:pict w14:anchorId="30DC3963">
-          <v:rect id="_x0000_i1127" style="width:0;height:1.5pt" o:hralign="center" o:hrstd="t" o:hr="t" fillcolor="#a0a0a0" stroked="f"/>
+          <v:rect id="_x0000_i1031" style="width:0;height:1.5pt" o:hralign="center" o:hrstd="t" o:hr="t" fillcolor="#a0a0a0" stroked="f"/>
         </w:pict>
       </w:r>
     </w:p>
@@ -2864,643 +2864,2158 @@
       </w:r>
     </w:p>
     <w:p>
-      <w:r>
+      <w:pPr>
+        <w:rPr>
+          <w:highlight w:val="yellow"/>
+        </w:rPr>
+      </w:pPr>
+      <w:r>
+        <w:rPr>
+          <w:highlight w:val="yellow"/>
+        </w:rPr>
         <w:t>You are a senior enterprise frontend engineer.</w:t>
       </w:r>
     </w:p>
-    <w:p/>
-    <w:p>
-      <w:r>
+    <w:p>
+      <w:pPr>
+        <w:rPr>
+          <w:highlight w:val="yellow"/>
+        </w:rPr>
+      </w:pPr>
+    </w:p>
+    <w:p>
+      <w:pPr>
+        <w:rPr>
+          <w:highlight w:val="yellow"/>
+        </w:rPr>
+      </w:pPr>
+      <w:r>
+        <w:rPr>
+          <w:highlight w:val="yellow"/>
+        </w:rPr>
         <w:t>This is REAL FRONTEND DEVELOPMENT, not documentation.</w:t>
       </w:r>
     </w:p>
-    <w:p/>
-    <w:p>
-      <w:r>
+    <w:p>
+      <w:pPr>
+        <w:rPr>
+          <w:highlight w:val="yellow"/>
+        </w:rPr>
+      </w:pPr>
+    </w:p>
+    <w:p>
+      <w:pPr>
+        <w:rPr>
+          <w:highlight w:val="yellow"/>
+        </w:rPr>
+      </w:pPr>
+      <w:r>
+        <w:rPr>
+          <w:highlight w:val="yellow"/>
+        </w:rPr>
         <w:t>Build FULLY FUNCTIONAL UI pages for Financial Management in QEGPMO,</w:t>
       </w:r>
     </w:p>
     <w:p>
-      <w:r>
+      <w:pPr>
+        <w:rPr>
+          <w:highlight w:val="yellow"/>
+        </w:rPr>
+      </w:pPr>
+      <w:r>
+        <w:rPr>
+          <w:highlight w:val="yellow"/>
+        </w:rPr>
         <w:t>extending the EXISTING frontend application without modifying</w:t>
       </w:r>
     </w:p>
     <w:p>
-      <w:r>
+      <w:pPr>
+        <w:rPr>
+          <w:highlight w:val="yellow"/>
+        </w:rPr>
+      </w:pPr>
+      <w:r>
+        <w:rPr>
+          <w:highlight w:val="yellow"/>
+        </w:rPr>
         <w:t xml:space="preserve">the global </w:t>
       </w:r>
       <w:proofErr w:type="spellStart"/>
       <w:r>
+        <w:rPr>
+          <w:highlight w:val="yellow"/>
+        </w:rPr>
         <w:t>AppShell</w:t>
       </w:r>
       <w:proofErr w:type="spellEnd"/>
       <w:r>
+        <w:rPr>
+          <w:highlight w:val="yellow"/>
+        </w:rPr>
         <w:t>, navigation, authentication, or routing structure.</w:t>
       </w:r>
     </w:p>
-    <w:p/>
-    <w:p>
-      <w:r>
+    <w:p>
+      <w:pPr>
+        <w:rPr>
+          <w:highlight w:val="yellow"/>
+        </w:rPr>
+      </w:pPr>
+    </w:p>
+    <w:p>
+      <w:pPr>
+        <w:rPr>
+          <w:highlight w:val="yellow"/>
+        </w:rPr>
+      </w:pPr>
+      <w:r>
+        <w:rPr>
+          <w:highlight w:val="yellow"/>
+        </w:rPr>
         <w:t>This implementation MUST strictly follow:</w:t>
       </w:r>
     </w:p>
     <w:p>
-      <w:r>
+      <w:pPr>
+        <w:rPr>
+          <w:highlight w:val="yellow"/>
+        </w:rPr>
+      </w:pPr>
+      <w:r>
+        <w:rPr>
+          <w:highlight w:val="yellow"/>
+        </w:rPr>
         <w:t>- The approved QEGPMO Domain Model (Canvas)</w:t>
       </w:r>
     </w:p>
     <w:p>
-      <w:r>
+      <w:pPr>
+        <w:rPr>
+          <w:highlight w:val="yellow"/>
+        </w:rPr>
+      </w:pPr>
+      <w:r>
+        <w:rPr>
+          <w:highlight w:val="yellow"/>
+        </w:rPr>
         <w:t>- The approved Aggregation &amp; Roll-up Logic (Canvas)</w:t>
       </w:r>
     </w:p>
     <w:p>
-      <w:r>
+      <w:pPr>
+        <w:rPr>
+          <w:highlight w:val="yellow"/>
+        </w:rPr>
+      </w:pPr>
+      <w:r>
+        <w:rPr>
+          <w:highlight w:val="yellow"/>
+        </w:rPr>
         <w:lastRenderedPageBreak/>
         <w:t>- The approved Financial Management backend behavior</w:t>
       </w:r>
     </w:p>
     <w:p>
-      <w:r>
+      <w:pPr>
+        <w:rPr>
+          <w:highlight w:val="yellow"/>
+        </w:rPr>
+      </w:pPr>
+      <w:r>
+        <w:rPr>
+          <w:highlight w:val="yellow"/>
+        </w:rPr>
         <w:t>- The Core Platform Foundation rules (RBAC, tenancy, audit)</w:t>
       </w:r>
     </w:p>
-    <w:p/>
-    <w:p>
-      <w:r>
+    <w:p>
+      <w:pPr>
+        <w:rPr>
+          <w:highlight w:val="yellow"/>
+        </w:rPr>
+      </w:pPr>
+    </w:p>
+    <w:p>
+      <w:pPr>
+        <w:rPr>
+          <w:highlight w:val="yellow"/>
+        </w:rPr>
+      </w:pPr>
+      <w:r>
+        <w:rPr>
+          <w:highlight w:val="yellow"/>
+        </w:rPr>
         <w:t>SCOPE — FINANCIAL MANAGEMENT UI:</w:t>
       </w:r>
     </w:p>
-    <w:p/>
-    <w:p>
-      <w:r>
+    <w:p>
+      <w:pPr>
+        <w:rPr>
+          <w:highlight w:val="yellow"/>
+        </w:rPr>
+      </w:pPr>
+    </w:p>
+    <w:p>
+      <w:pPr>
+        <w:rPr>
+          <w:highlight w:val="yellow"/>
+        </w:rPr>
+      </w:pPr>
+      <w:r>
+        <w:rPr>
+          <w:highlight w:val="yellow"/>
+        </w:rPr>
         <w:t>Pages must include:</w:t>
       </w:r>
     </w:p>
-    <w:p/>
-    <w:p>
-      <w:r>
+    <w:p>
+      <w:pPr>
+        <w:rPr>
+          <w:highlight w:val="yellow"/>
+        </w:rPr>
+      </w:pPr>
+    </w:p>
+    <w:p>
+      <w:pPr>
+        <w:rPr>
+          <w:highlight w:val="yellow"/>
+        </w:rPr>
+      </w:pPr>
+      <w:r>
+        <w:rPr>
+          <w:highlight w:val="yellow"/>
+        </w:rPr>
         <w:t>1. Budgets UI</w:t>
       </w:r>
     </w:p>
     <w:p>
-      <w:r>
+      <w:pPr>
+        <w:rPr>
+          <w:highlight w:val="yellow"/>
+        </w:rPr>
+      </w:pPr>
+      <w:r>
+        <w:rPr>
+          <w:highlight w:val="yellow"/>
+        </w:rPr>
         <w:t>- Budget list page (CAPEX / OPEX)</w:t>
       </w:r>
     </w:p>
     <w:p>
-      <w:r>
+      <w:pPr>
+        <w:rPr>
+          <w:highlight w:val="yellow"/>
+        </w:rPr>
+      </w:pPr>
+      <w:r>
+        <w:rPr>
+          <w:highlight w:val="yellow"/>
+        </w:rPr>
         <w:t>- Budget detail page</w:t>
       </w:r>
     </w:p>
     <w:p>
-      <w:r>
+      <w:pPr>
+        <w:rPr>
+          <w:highlight w:val="yellow"/>
+        </w:rPr>
+      </w:pPr>
+      <w:r>
+        <w:rPr>
+          <w:highlight w:val="yellow"/>
+        </w:rPr>
         <w:t>- Approved budget baselines</w:t>
       </w:r>
     </w:p>
     <w:p>
-      <w:r>
+      <w:pPr>
+        <w:rPr>
+          <w:highlight w:val="yellow"/>
+        </w:rPr>
+      </w:pPr>
+      <w:r>
+        <w:rPr>
+          <w:highlight w:val="yellow"/>
+        </w:rPr>
         <w:t>- Read-only vs editable behavior enforced by RBAC</w:t>
       </w:r>
     </w:p>
-    <w:p/>
-    <w:p>
-      <w:r>
+    <w:p>
+      <w:pPr>
+        <w:rPr>
+          <w:highlight w:val="yellow"/>
+        </w:rPr>
+      </w:pPr>
+    </w:p>
+    <w:p>
+      <w:pPr>
+        <w:rPr>
+          <w:highlight w:val="yellow"/>
+        </w:rPr>
+      </w:pPr>
+      <w:r>
+        <w:rPr>
+          <w:highlight w:val="yellow"/>
+        </w:rPr>
         <w:t>2. Forecasts UI</w:t>
       </w:r>
     </w:p>
     <w:p>
-      <w:r>
+      <w:pPr>
+        <w:rPr>
+          <w:highlight w:val="yellow"/>
+        </w:rPr>
+      </w:pPr>
+      <w:r>
+        <w:rPr>
+          <w:highlight w:val="yellow"/>
+        </w:rPr>
         <w:t>- Forecast list and detail views</w:t>
       </w:r>
     </w:p>
     <w:p>
-      <w:r>
+      <w:pPr>
+        <w:rPr>
+          <w:highlight w:val="yellow"/>
+        </w:rPr>
+      </w:pPr>
+      <w:r>
+        <w:rPr>
+          <w:highlight w:val="yellow"/>
+        </w:rPr>
         <w:t>- ETC and EAC values rendered from backend</w:t>
       </w:r>
     </w:p>
     <w:p>
-      <w:r>
+      <w:pPr>
+        <w:rPr>
+          <w:highlight w:val="yellow"/>
+        </w:rPr>
+      </w:pPr>
+      <w:r>
+        <w:rPr>
+          <w:highlight w:val="yellow"/>
+        </w:rPr>
         <w:t>- Forecast history and updates</w:t>
       </w:r>
     </w:p>
     <w:p>
-      <w:r>
+      <w:pPr>
+        <w:rPr>
+          <w:highlight w:val="yellow"/>
+        </w:rPr>
+      </w:pPr>
+      <w:r>
+        <w:rPr>
+          <w:highlight w:val="yellow"/>
+        </w:rPr>
         <w:t>- No forecast calculations in UI</w:t>
       </w:r>
     </w:p>
-    <w:p/>
-    <w:p>
-      <w:r>
+    <w:p>
+      <w:pPr>
+        <w:rPr>
+          <w:highlight w:val="yellow"/>
+        </w:rPr>
+      </w:pPr>
+    </w:p>
+    <w:p>
+      <w:pPr>
+        <w:rPr>
+          <w:highlight w:val="yellow"/>
+        </w:rPr>
+      </w:pPr>
+      <w:r>
+        <w:rPr>
+          <w:highlight w:val="yellow"/>
+        </w:rPr>
         <w:t>3. Actual Costs UI</w:t>
       </w:r>
     </w:p>
     <w:p>
-      <w:r>
+      <w:pPr>
+        <w:rPr>
+          <w:highlight w:val="yellow"/>
+        </w:rPr>
+      </w:pPr>
+      <w:r>
+        <w:rPr>
+          <w:highlight w:val="yellow"/>
+        </w:rPr>
         <w:t>- Actual cost entries by period</w:t>
       </w:r>
     </w:p>
     <w:p>
-      <w:r>
+      <w:pPr>
+        <w:rPr>
+          <w:highlight w:val="yellow"/>
+        </w:rPr>
+      </w:pPr>
+      <w:r>
+        <w:rPr>
+          <w:highlight w:val="yellow"/>
+        </w:rPr>
         <w:t>- Historical actuals view</w:t>
       </w:r>
     </w:p>
     <w:p>
-      <w:r>
+      <w:pPr>
+        <w:rPr>
+          <w:highlight w:val="yellow"/>
+        </w:rPr>
+      </w:pPr>
+      <w:r>
+        <w:rPr>
+          <w:highlight w:val="yellow"/>
+        </w:rPr>
         <w:t>- Read-only executive view</w:t>
       </w:r>
     </w:p>
-    <w:p/>
-    <w:p>
-      <w:r>
+    <w:p>
+      <w:pPr>
+        <w:rPr>
+          <w:highlight w:val="yellow"/>
+        </w:rPr>
+      </w:pPr>
+    </w:p>
+    <w:p>
+      <w:pPr>
+        <w:rPr>
+          <w:highlight w:val="yellow"/>
+        </w:rPr>
+      </w:pPr>
+      <w:r>
+        <w:rPr>
+          <w:highlight w:val="yellow"/>
+        </w:rPr>
         <w:t>4. Variance &amp; Status Indicators</w:t>
       </w:r>
     </w:p>
     <w:p>
-      <w:r>
+      <w:pPr>
+        <w:rPr>
+          <w:highlight w:val="yellow"/>
+        </w:rPr>
+      </w:pPr>
+      <w:r>
+        <w:rPr>
+          <w:highlight w:val="yellow"/>
+        </w:rPr>
         <w:t>- Cost variance indicators using RAG</w:t>
       </w:r>
     </w:p>
     <w:p>
-      <w:r>
+      <w:pPr>
+        <w:rPr>
+          <w:highlight w:val="yellow"/>
+        </w:rPr>
+      </w:pPr>
+      <w:r>
+        <w:rPr>
+          <w:highlight w:val="yellow"/>
+        </w:rPr>
         <w:lastRenderedPageBreak/>
         <w:t>- Clear visual comparison against baselines</w:t>
       </w:r>
     </w:p>
     <w:p>
-      <w:r>
+      <w:pPr>
+        <w:rPr>
+          <w:highlight w:val="yellow"/>
+        </w:rPr>
+      </w:pPr>
+      <w:r>
+        <w:rPr>
+          <w:highlight w:val="yellow"/>
+        </w:rPr>
         <w:t>- Backend-calculated values only</w:t>
       </w:r>
     </w:p>
+    <w:p>
+      <w:pPr>
+        <w:rPr>
+          <w:highlight w:val="yellow"/>
+        </w:rPr>
+      </w:pPr>
+    </w:p>
+    <w:p>
+      <w:pPr>
+        <w:rPr>
+          <w:highlight w:val="yellow"/>
+        </w:rPr>
+      </w:pPr>
+      <w:r>
+        <w:rPr>
+          <w:highlight w:val="yellow"/>
+        </w:rPr>
+        <w:t>5. Historical Snapshots</w:t>
+      </w:r>
+    </w:p>
+    <w:p>
+      <w:pPr>
+        <w:rPr>
+          <w:highlight w:val="yellow"/>
+        </w:rPr>
+      </w:pPr>
+      <w:r>
+        <w:rPr>
+          <w:highlight w:val="yellow"/>
+        </w:rPr>
+        <w:t>- Display of historical budget and forecast snapshots</w:t>
+      </w:r>
+    </w:p>
+    <w:p>
+      <w:pPr>
+        <w:rPr>
+          <w:highlight w:val="yellow"/>
+        </w:rPr>
+      </w:pPr>
+      <w:r>
+        <w:rPr>
+          <w:highlight w:val="yellow"/>
+        </w:rPr>
+        <w:t xml:space="preserve">- </w:t>
+      </w:r>
+      <w:r>
+        <w:rPr>
+          <w:highlight w:val="yellow"/>
+        </w:rPr>
+        <w:t>Trend visualization over time</w:t>
+      </w:r>
+      <w:r>
+        <w:rPr>
+          <w:highlight w:val="yellow"/>
+        </w:rPr>
+        <w:pict w14:anchorId="0B9258D2">
+          <v:rect id="_x0000_i1032" style="width:0;height:1.5pt" o:hralign="center" o:hrstd="t" o:hr="t" fillcolor="#a0a0a0" stroked="f"/>
+        </w:pict>
+      </w:r>
+    </w:p>
+    <w:p>
+      <w:pPr>
+        <w:rPr>
+          <w:b/>
+          <w:bCs/>
+          <w:highlight w:val="yellow"/>
+        </w:rPr>
+      </w:pPr>
+      <w:r>
+        <w:rPr>
+          <w:rFonts w:ascii="Segoe UI Emoji" w:hAnsi="Segoe UI Emoji" w:cs="Segoe UI Emoji"/>
+          <w:b/>
+          <w:bCs/>
+          <w:highlight w:val="yellow"/>
+        </w:rPr>
+        <w:t>🔹</w:t>
+      </w:r>
+      <w:r>
+        <w:rPr>
+          <w:b/>
+          <w:bCs/>
+          <w:highlight w:val="yellow"/>
+        </w:rPr>
+        <w:t xml:space="preserve"> PROMPT 16 — RISK &amp; ISSUE MANAGEMENT UI</w:t>
+      </w:r>
+    </w:p>
+    <w:p>
+      <w:pPr>
+        <w:rPr>
+          <w:highlight w:val="yellow"/>
+        </w:rPr>
+      </w:pPr>
+      <w:r>
+        <w:rPr>
+          <w:highlight w:val="yellow"/>
+        </w:rPr>
+        <w:t>Build UI pages for Risk and Issue Management using the EXISTING UI framework and routing.</w:t>
+      </w:r>
+    </w:p>
+    <w:p>
+      <w:pPr>
+        <w:rPr>
+          <w:highlight w:val="yellow"/>
+        </w:rPr>
+      </w:pPr>
+    </w:p>
+    <w:p>
+      <w:pPr>
+        <w:rPr>
+          <w:highlight w:val="yellow"/>
+        </w:rPr>
+      </w:pPr>
+      <w:r>
+        <w:rPr>
+          <w:highlight w:val="yellow"/>
+        </w:rPr>
+        <w:t>Scope and constraints:</w:t>
+      </w:r>
+    </w:p>
+    <w:p>
+      <w:pPr>
+        <w:rPr>
+          <w:highlight w:val="yellow"/>
+        </w:rPr>
+      </w:pPr>
+      <w:r>
+        <w:rPr>
+          <w:highlight w:val="yellow"/>
+        </w:rPr>
+        <w:t>- Use current layout, components, and design system</w:t>
+      </w:r>
+    </w:p>
+    <w:p>
+      <w:pPr>
+        <w:rPr>
+          <w:highlight w:val="yellow"/>
+        </w:rPr>
+      </w:pPr>
+      <w:r>
+        <w:rPr>
+          <w:highlight w:val="yellow"/>
+        </w:rPr>
+        <w:t>- Do NOT modify backend APIs or database schema</w:t>
+      </w:r>
+    </w:p>
+    <w:p>
+      <w:pPr>
+        <w:rPr>
+          <w:highlight w:val="yellow"/>
+        </w:rPr>
+      </w:pPr>
+      <w:r>
+        <w:rPr>
+          <w:highlight w:val="yellow"/>
+        </w:rPr>
+        <w:t>- Do NOT redesign existing workflows</w:t>
+      </w:r>
+    </w:p>
+    <w:p>
+      <w:pPr>
+        <w:rPr>
+          <w:highlight w:val="yellow"/>
+        </w:rPr>
+      </w:pPr>
+      <w:r>
+        <w:rPr>
+          <w:highlight w:val="yellow"/>
+        </w:rPr>
+        <w:t>- UI only (assume APIs already exist)</w:t>
+      </w:r>
+    </w:p>
+    <w:p>
+      <w:pPr>
+        <w:rPr>
+          <w:highlight w:val="yellow"/>
+        </w:rPr>
+      </w:pPr>
+      <w:r>
+        <w:rPr>
+          <w:highlight w:val="yellow"/>
+        </w:rPr>
+        <w:t>- Keep changes minimal and incremental</w:t>
+      </w:r>
+    </w:p>
+    <w:p>
+      <w:pPr>
+        <w:rPr>
+          <w:highlight w:val="yellow"/>
+        </w:rPr>
+      </w:pPr>
+    </w:p>
+    <w:p>
+      <w:pPr>
+        <w:rPr>
+          <w:highlight w:val="yellow"/>
+        </w:rPr>
+      </w:pPr>
+      <w:r>
+        <w:rPr>
+          <w:highlight w:val="yellow"/>
+        </w:rPr>
+        <w:t>Pages to implement:</w:t>
+      </w:r>
+    </w:p>
+    <w:p>
+      <w:pPr>
+        <w:rPr>
+          <w:highlight w:val="yellow"/>
+        </w:rPr>
+      </w:pPr>
+      <w:r>
+        <w:rPr>
+          <w:highlight w:val="yellow"/>
+        </w:rPr>
+        <w:t>1. Risk Register page</w:t>
+      </w:r>
+    </w:p>
+    <w:p>
+      <w:pPr>
+        <w:rPr>
+          <w:highlight w:val="yellow"/>
+        </w:rPr>
+      </w:pPr>
+      <w:r>
+        <w:rPr>
+          <w:highlight w:val="yellow"/>
+        </w:rPr>
+        <w:t>   - Tabular list with pagination</w:t>
+      </w:r>
+    </w:p>
+    <w:p>
+      <w:pPr>
+        <w:rPr>
+          <w:highlight w:val="yellow"/>
+        </w:rPr>
+      </w:pPr>
+      <w:r>
+        <w:rPr>
+          <w:highlight w:val="yellow"/>
+        </w:rPr>
+        <w:t>   - Severity visual indicator (color / badge)</w:t>
+      </w:r>
+    </w:p>
+    <w:p>
+      <w:pPr>
+        <w:rPr>
+          <w:highlight w:val="yellow"/>
+        </w:rPr>
+      </w:pPr>
+      <w:r>
+        <w:rPr>
+          <w:highlight w:val="yellow"/>
+        </w:rPr>
+        <w:t>   - Aging indicator (calculated from existing fields)</w:t>
+      </w:r>
+    </w:p>
+    <w:p>
+      <w:pPr>
+        <w:rPr>
+          <w:highlight w:val="yellow"/>
+        </w:rPr>
+      </w:pPr>
+      <w:r>
+        <w:rPr>
+          <w:highlight w:val="yellow"/>
+        </w:rPr>
+        <w:t>   - Escalation flag (read-only)</w:t>
+      </w:r>
+    </w:p>
+    <w:p>
+      <w:pPr>
+        <w:rPr>
+          <w:highlight w:val="yellow"/>
+        </w:rPr>
+      </w:pPr>
+    </w:p>
+    <w:p>
+      <w:pPr>
+        <w:rPr>
+          <w:highlight w:val="yellow"/>
+        </w:rPr>
+      </w:pPr>
+      <w:r>
+        <w:rPr>
+          <w:highlight w:val="yellow"/>
+        </w:rPr>
+        <w:t xml:space="preserve">2. </w:t>
+      </w:r>
+      <w:proofErr w:type="gramStart"/>
+      <w:r>
+        <w:rPr>
+          <w:highlight w:val="yellow"/>
+        </w:rPr>
+        <w:t>Issue Register page</w:t>
+      </w:r>
+      <w:proofErr w:type="gramEnd"/>
+    </w:p>
+    <w:p>
+      <w:pPr>
+        <w:rPr>
+          <w:highlight w:val="yellow"/>
+        </w:rPr>
+      </w:pPr>
+      <w:r>
+        <w:rPr>
+          <w:highlight w:val="yellow"/>
+        </w:rPr>
+        <w:lastRenderedPageBreak/>
+        <w:t>   - Same patterns as Risk Register</w:t>
+      </w:r>
+    </w:p>
+    <w:p>
+      <w:pPr>
+        <w:rPr>
+          <w:highlight w:val="yellow"/>
+        </w:rPr>
+      </w:pPr>
+    </w:p>
+    <w:p>
+      <w:pPr>
+        <w:rPr>
+          <w:highlight w:val="yellow"/>
+        </w:rPr>
+      </w:pPr>
+      <w:r>
+        <w:rPr>
+          <w:highlight w:val="yellow"/>
+        </w:rPr>
+        <w:t>3. Risk Details page</w:t>
+      </w:r>
+    </w:p>
+    <w:p>
+      <w:pPr>
+        <w:rPr>
+          <w:highlight w:val="yellow"/>
+        </w:rPr>
+      </w:pPr>
+      <w:r>
+        <w:rPr>
+          <w:highlight w:val="yellow"/>
+        </w:rPr>
+        <w:t>   - Read-only metadata section</w:t>
+      </w:r>
+    </w:p>
+    <w:p>
+      <w:pPr>
+        <w:rPr>
+          <w:highlight w:val="yellow"/>
+        </w:rPr>
+      </w:pPr>
+      <w:r>
+        <w:rPr>
+          <w:highlight w:val="yellow"/>
+        </w:rPr>
+        <w:t>   - Severity, aging, escalation indicators</w:t>
+      </w:r>
+    </w:p>
+    <w:p>
+      <w:pPr>
+        <w:rPr>
+          <w:highlight w:val="yellow"/>
+        </w:rPr>
+      </w:pPr>
+      <w:r>
+        <w:rPr>
+          <w:highlight w:val="yellow"/>
+        </w:rPr>
+        <w:t>   - Approval action buttons that CALL existing workflow APIs (no logic change)</w:t>
+      </w:r>
+    </w:p>
+    <w:p>
+      <w:pPr>
+        <w:rPr>
+          <w:highlight w:val="yellow"/>
+        </w:rPr>
+      </w:pPr>
+    </w:p>
+    <w:p>
+      <w:pPr>
+        <w:rPr>
+          <w:highlight w:val="yellow"/>
+        </w:rPr>
+      </w:pPr>
+      <w:r>
+        <w:rPr>
+          <w:highlight w:val="yellow"/>
+        </w:rPr>
+        <w:t>4. Issue Details page</w:t>
+      </w:r>
+    </w:p>
+    <w:p>
+      <w:pPr>
+        <w:rPr>
+          <w:highlight w:val="yellow"/>
+        </w:rPr>
+      </w:pPr>
+      <w:r>
+        <w:rPr>
+          <w:highlight w:val="yellow"/>
+        </w:rPr>
+        <w:t>   - Same pattern as Risk Details</w:t>
+      </w:r>
+    </w:p>
+    <w:p>
+      <w:pPr>
+        <w:rPr>
+          <w:highlight w:val="yellow"/>
+        </w:rPr>
+      </w:pPr>
+    </w:p>
+    <w:p>
+      <w:pPr>
+        <w:rPr>
+          <w:highlight w:val="yellow"/>
+        </w:rPr>
+      </w:pPr>
+      <w:r>
+        <w:rPr>
+          <w:highlight w:val="yellow"/>
+        </w:rPr>
+        <w:t>Notes:</w:t>
+      </w:r>
+    </w:p>
+    <w:p>
+      <w:pPr>
+        <w:rPr>
+          <w:highlight w:val="yellow"/>
+        </w:rPr>
+      </w:pPr>
+      <w:r>
+        <w:rPr>
+          <w:highlight w:val="yellow"/>
+        </w:rPr>
+        <w:t>- Reuse existing components wherever possible</w:t>
+      </w:r>
+    </w:p>
+    <w:p>
+      <w:r>
+        <w:rPr>
+          <w:highlight w:val="yellow"/>
+        </w:rPr>
+        <w:t>- No architectural or state management refactor</w:t>
+      </w:r>
+    </w:p>
+    <w:p>
+      <w:r>
+        <w:pict w14:anchorId="08661934">
+          <v:rect id="_x0000_i1033" style="width:0;height:1.5pt" o:hralign="center" o:hrstd="t" o:hr="t" fillcolor="#a0a0a0" stroked="f"/>
+        </w:pict>
+      </w:r>
+    </w:p>
+    <w:p>
+      <w:pPr>
+        <w:rPr>
+          <w:rFonts w:ascii="Segoe UI Emoji" w:hAnsi="Segoe UI Emoji" w:cs="Segoe UI Emoji"/>
+          <w:b/>
+          <w:bCs/>
+          <w:highlight w:val="yellow"/>
+        </w:rPr>
+      </w:pPr>
+      <w:r>
+        <w:rPr>
+          <w:rFonts w:ascii="Segoe UI Emoji" w:hAnsi="Segoe UI Emoji" w:cs="Segoe UI Emoji"/>
+          <w:b/>
+          <w:bCs/>
+          <w:highlight w:val="yellow"/>
+        </w:rPr>
+        <w:t>Build UI pages for Change Management using the EXISTING UI framework, routing, and components.</w:t>
+      </w:r>
+    </w:p>
+    <w:p>
+      <w:pPr>
+        <w:rPr>
+          <w:rFonts w:ascii="Segoe UI Emoji" w:hAnsi="Segoe UI Emoji" w:cs="Segoe UI Emoji"/>
+          <w:b/>
+          <w:bCs/>
+          <w:highlight w:val="yellow"/>
+        </w:rPr>
+      </w:pPr>
+    </w:p>
+    <w:p>
+      <w:pPr>
+        <w:rPr>
+          <w:rFonts w:ascii="Segoe UI Emoji" w:hAnsi="Segoe UI Emoji" w:cs="Segoe UI Emoji"/>
+          <w:b/>
+          <w:bCs/>
+          <w:highlight w:val="yellow"/>
+        </w:rPr>
+      </w:pPr>
+      <w:r>
+        <w:rPr>
+          <w:rFonts w:ascii="Segoe UI Emoji" w:hAnsi="Segoe UI Emoji" w:cs="Segoe UI Emoji"/>
+          <w:b/>
+          <w:bCs/>
+          <w:highlight w:val="yellow"/>
+        </w:rPr>
+        <w:t>Scope and constraints:</w:t>
+      </w:r>
+    </w:p>
+    <w:p>
+      <w:pPr>
+        <w:rPr>
+          <w:rFonts w:ascii="Segoe UI Emoji" w:hAnsi="Segoe UI Emoji" w:cs="Segoe UI Emoji"/>
+          <w:b/>
+          <w:bCs/>
+          <w:highlight w:val="yellow"/>
+        </w:rPr>
+      </w:pPr>
+      <w:r>
+        <w:rPr>
+          <w:rFonts w:ascii="Segoe UI Emoji" w:hAnsi="Segoe UI Emoji" w:cs="Segoe UI Emoji"/>
+          <w:b/>
+          <w:bCs/>
+          <w:highlight w:val="yellow"/>
+        </w:rPr>
+        <w:t>- UI only (assume backend APIs already exist)</w:t>
+      </w:r>
+    </w:p>
+    <w:p>
+      <w:pPr>
+        <w:rPr>
+          <w:rFonts w:ascii="Segoe UI Emoji" w:hAnsi="Segoe UI Emoji" w:cs="Segoe UI Emoji"/>
+          <w:b/>
+          <w:bCs/>
+          <w:highlight w:val="yellow"/>
+        </w:rPr>
+      </w:pPr>
+      <w:r>
+        <w:rPr>
+          <w:rFonts w:ascii="Segoe UI Emoji" w:hAnsi="Segoe UI Emoji" w:cs="Segoe UI Emoji"/>
+          <w:b/>
+          <w:bCs/>
+          <w:highlight w:val="yellow"/>
+        </w:rPr>
+        <w:t>- Do NOT modify backend APIs, database schema, RBAC rules, or workflow logic</w:t>
+      </w:r>
+    </w:p>
+    <w:p>
+      <w:pPr>
+        <w:rPr>
+          <w:rFonts w:ascii="Segoe UI Emoji" w:hAnsi="Segoe UI Emoji" w:cs="Segoe UI Emoji"/>
+          <w:b/>
+          <w:bCs/>
+          <w:highlight w:val="yellow"/>
+        </w:rPr>
+      </w:pPr>
+      <w:r>
+        <w:rPr>
+          <w:rFonts w:ascii="Segoe UI Emoji" w:hAnsi="Segoe UI Emoji" w:cs="Segoe UI Emoji"/>
+          <w:b/>
+          <w:bCs/>
+          <w:highlight w:val="yellow"/>
+        </w:rPr>
+        <w:t>- Do NOT redesign change workflows</w:t>
+      </w:r>
+    </w:p>
+    <w:p>
+      <w:pPr>
+        <w:rPr>
+          <w:rFonts w:ascii="Segoe UI Emoji" w:hAnsi="Segoe UI Emoji" w:cs="Segoe UI Emoji"/>
+          <w:b/>
+          <w:bCs/>
+          <w:highlight w:val="yellow"/>
+        </w:rPr>
+      </w:pPr>
+      <w:r>
+        <w:rPr>
+          <w:rFonts w:ascii="Segoe UI Emoji" w:hAnsi="Segoe UI Emoji" w:cs="Segoe UI Emoji"/>
+          <w:b/>
+          <w:bCs/>
+          <w:highlight w:val="yellow"/>
+        </w:rPr>
+        <w:t>- Keep changes minimal and incremental</w:t>
+      </w:r>
+    </w:p>
+    <w:p>
+      <w:pPr>
+        <w:rPr>
+          <w:rFonts w:ascii="Segoe UI Emoji" w:hAnsi="Segoe UI Emoji" w:cs="Segoe UI Emoji"/>
+          <w:b/>
+          <w:bCs/>
+          <w:highlight w:val="yellow"/>
+        </w:rPr>
+      </w:pPr>
+    </w:p>
+    <w:p>
+      <w:pPr>
+        <w:rPr>
+          <w:rFonts w:ascii="Segoe UI Emoji" w:hAnsi="Segoe UI Emoji" w:cs="Segoe UI Emoji"/>
+          <w:b/>
+          <w:bCs/>
+          <w:highlight w:val="yellow"/>
+        </w:rPr>
+      </w:pPr>
+      <w:r>
+        <w:rPr>
+          <w:rFonts w:ascii="Segoe UI Emoji" w:hAnsi="Segoe UI Emoji" w:cs="Segoe UI Emoji"/>
+          <w:b/>
+          <w:bCs/>
+          <w:highlight w:val="yellow"/>
+        </w:rPr>
+        <w:t>Pages:</w:t>
+      </w:r>
+    </w:p>
+    <w:p>
+      <w:pPr>
+        <w:rPr>
+          <w:rFonts w:ascii="Segoe UI Emoji" w:hAnsi="Segoe UI Emoji" w:cs="Segoe UI Emoji"/>
+          <w:b/>
+          <w:bCs/>
+          <w:highlight w:val="yellow"/>
+        </w:rPr>
+      </w:pPr>
+      <w:r>
+        <w:rPr>
+          <w:rFonts w:ascii="Segoe UI Emoji" w:hAnsi="Segoe UI Emoji" w:cs="Segoe UI Emoji"/>
+          <w:b/>
+          <w:bCs/>
+          <w:highlight w:val="yellow"/>
+        </w:rPr>
+        <w:t>1. Change Request List</w:t>
+      </w:r>
+    </w:p>
+    <w:p>
+      <w:pPr>
+        <w:rPr>
+          <w:rFonts w:ascii="Segoe UI Emoji" w:hAnsi="Segoe UI Emoji" w:cs="Segoe UI Emoji"/>
+          <w:b/>
+          <w:bCs/>
+          <w:highlight w:val="yellow"/>
+        </w:rPr>
+      </w:pPr>
+      <w:r>
+        <w:rPr>
+          <w:rFonts w:ascii="Segoe UI Emoji" w:hAnsi="Segoe UI Emoji" w:cs="Segoe UI Emoji"/>
+          <w:b/>
+          <w:bCs/>
+          <w:highlight w:val="yellow"/>
+        </w:rPr>
+        <w:lastRenderedPageBreak/>
+        <w:t>   - Paginated table</w:t>
+      </w:r>
+    </w:p>
+    <w:p>
+      <w:pPr>
+        <w:rPr>
+          <w:rFonts w:ascii="Segoe UI Emoji" w:hAnsi="Segoe UI Emoji" w:cs="Segoe UI Emoji"/>
+          <w:b/>
+          <w:bCs/>
+          <w:highlight w:val="yellow"/>
+        </w:rPr>
+      </w:pPr>
+      <w:r>
+        <w:rPr>
+          <w:rFonts w:ascii="Segoe UI Emoji" w:hAnsi="Segoe UI Emoji" w:cs="Segoe UI Emoji"/>
+          <w:b/>
+          <w:bCs/>
+          <w:highlight w:val="yellow"/>
+        </w:rPr>
+        <w:t>   - Status indicator (badge/color)</w:t>
+      </w:r>
+    </w:p>
+    <w:p>
+      <w:pPr>
+        <w:rPr>
+          <w:rFonts w:ascii="Segoe UI Emoji" w:hAnsi="Segoe UI Emoji" w:cs="Segoe UI Emoji"/>
+          <w:b/>
+          <w:bCs/>
+          <w:highlight w:val="yellow"/>
+        </w:rPr>
+      </w:pPr>
+      <w:r>
+        <w:rPr>
+          <w:rFonts w:ascii="Segoe UI Emoji" w:hAnsi="Segoe UI Emoji" w:cs="Segoe UI Emoji"/>
+          <w:b/>
+          <w:bCs/>
+          <w:highlight w:val="yellow"/>
+        </w:rPr>
+        <w:t>   - Basic metadata only</w:t>
+      </w:r>
+    </w:p>
+    <w:p>
+      <w:pPr>
+        <w:rPr>
+          <w:rFonts w:ascii="Segoe UI Emoji" w:hAnsi="Segoe UI Emoji" w:cs="Segoe UI Emoji"/>
+          <w:b/>
+          <w:bCs/>
+          <w:highlight w:val="yellow"/>
+        </w:rPr>
+      </w:pPr>
+    </w:p>
+    <w:p>
+      <w:pPr>
+        <w:rPr>
+          <w:rFonts w:ascii="Segoe UI Emoji" w:hAnsi="Segoe UI Emoji" w:cs="Segoe UI Emoji"/>
+          <w:b/>
+          <w:bCs/>
+          <w:highlight w:val="yellow"/>
+        </w:rPr>
+      </w:pPr>
+      <w:r>
+        <w:rPr>
+          <w:rFonts w:ascii="Segoe UI Emoji" w:hAnsi="Segoe UI Emoji" w:cs="Segoe UI Emoji"/>
+          <w:b/>
+          <w:bCs/>
+          <w:highlight w:val="yellow"/>
+        </w:rPr>
+        <w:t>2. Change Details Page</w:t>
+      </w:r>
+    </w:p>
+    <w:p>
+      <w:pPr>
+        <w:rPr>
+          <w:rFonts w:ascii="Segoe UI Emoji" w:hAnsi="Segoe UI Emoji" w:cs="Segoe UI Emoji"/>
+          <w:b/>
+          <w:bCs/>
+          <w:highlight w:val="yellow"/>
+        </w:rPr>
+      </w:pPr>
+      <w:r>
+        <w:rPr>
+          <w:rFonts w:ascii="Segoe UI Emoji" w:hAnsi="Segoe UI Emoji" w:cs="Segoe UI Emoji"/>
+          <w:b/>
+          <w:bCs/>
+          <w:highlight w:val="yellow"/>
+        </w:rPr>
+        <w:t>   - Read-only change metadata</w:t>
+      </w:r>
+    </w:p>
+    <w:p>
+      <w:pPr>
+        <w:rPr>
+          <w:rFonts w:ascii="Segoe UI Emoji" w:hAnsi="Segoe UI Emoji" w:cs="Segoe UI Emoji"/>
+          <w:b/>
+          <w:bCs/>
+          <w:highlight w:val="yellow"/>
+        </w:rPr>
+      </w:pPr>
+      <w:r>
+        <w:rPr>
+          <w:rFonts w:ascii="Segoe UI Emoji" w:hAnsi="Segoe UI Emoji" w:cs="Segoe UI Emoji"/>
+          <w:b/>
+          <w:bCs/>
+          <w:highlight w:val="yellow"/>
+        </w:rPr>
+        <w:t xml:space="preserve">   - </w:t>
+      </w:r>
+      <w:proofErr w:type="gramStart"/>
+      <w:r>
+        <w:rPr>
+          <w:rFonts w:ascii="Segoe UI Emoji" w:hAnsi="Segoe UI Emoji" w:cs="Segoe UI Emoji"/>
+          <w:b/>
+          <w:bCs/>
+          <w:highlight w:val="yellow"/>
+        </w:rPr>
+        <w:t>Current status</w:t>
+      </w:r>
+      <w:proofErr w:type="gramEnd"/>
+    </w:p>
+    <w:p>
+      <w:pPr>
+        <w:rPr>
+          <w:rFonts w:ascii="Segoe UI Emoji" w:hAnsi="Segoe UI Emoji" w:cs="Segoe UI Emoji"/>
+          <w:b/>
+          <w:bCs/>
+          <w:highlight w:val="yellow"/>
+        </w:rPr>
+      </w:pPr>
+      <w:r>
+        <w:rPr>
+          <w:rFonts w:ascii="Segoe UI Emoji" w:hAnsi="Segoe UI Emoji" w:cs="Segoe UI Emoji"/>
+          <w:b/>
+          <w:bCs/>
+          <w:highlight w:val="yellow"/>
+        </w:rPr>
+        <w:t>   - Linked entities (if available via API)</w:t>
+      </w:r>
+    </w:p>
+    <w:p>
+      <w:pPr>
+        <w:rPr>
+          <w:rFonts w:ascii="Segoe UI Emoji" w:hAnsi="Segoe UI Emoji" w:cs="Segoe UI Emoji"/>
+          <w:b/>
+          <w:bCs/>
+          <w:highlight w:val="yellow"/>
+        </w:rPr>
+      </w:pPr>
+    </w:p>
+    <w:p>
+      <w:pPr>
+        <w:rPr>
+          <w:rFonts w:ascii="Segoe UI Emoji" w:hAnsi="Segoe UI Emoji" w:cs="Segoe UI Emoji"/>
+          <w:b/>
+          <w:bCs/>
+          <w:highlight w:val="yellow"/>
+        </w:rPr>
+      </w:pPr>
+      <w:r>
+        <w:rPr>
+          <w:rFonts w:ascii="Segoe UI Emoji" w:hAnsi="Segoe UI Emoji" w:cs="Segoe UI Emoji"/>
+          <w:b/>
+          <w:bCs/>
+          <w:highlight w:val="yellow"/>
+        </w:rPr>
+        <w:t>3. Impact Analysis View</w:t>
+      </w:r>
+    </w:p>
+    <w:p>
+      <w:pPr>
+        <w:rPr>
+          <w:rFonts w:ascii="Segoe UI Emoji" w:hAnsi="Segoe UI Emoji" w:cs="Segoe UI Emoji"/>
+          <w:b/>
+          <w:bCs/>
+          <w:highlight w:val="yellow"/>
+        </w:rPr>
+      </w:pPr>
+      <w:r>
+        <w:rPr>
+          <w:rFonts w:ascii="Segoe UI Emoji" w:hAnsi="Segoe UI Emoji" w:cs="Segoe UI Emoji"/>
+          <w:b/>
+          <w:bCs/>
+          <w:highlight w:val="yellow"/>
+        </w:rPr>
+        <w:t>   - Read-only visualization using existing API fields only</w:t>
+      </w:r>
+    </w:p>
+    <w:p>
+      <w:pPr>
+        <w:rPr>
+          <w:rFonts w:ascii="Segoe UI Emoji" w:hAnsi="Segoe UI Emoji" w:cs="Segoe UI Emoji"/>
+          <w:b/>
+          <w:bCs/>
+          <w:highlight w:val="yellow"/>
+        </w:rPr>
+      </w:pPr>
+      <w:r>
+        <w:rPr>
+          <w:rFonts w:ascii="Segoe UI Emoji" w:hAnsi="Segoe UI Emoji" w:cs="Segoe UI Emoji"/>
+          <w:b/>
+          <w:bCs/>
+          <w:highlight w:val="yellow"/>
+        </w:rPr>
+        <w:t>   - Display impact on scope, schedule, cost, and resources</w:t>
+      </w:r>
+    </w:p>
+    <w:p>
+      <w:pPr>
+        <w:rPr>
+          <w:rFonts w:ascii="Segoe UI Emoji" w:hAnsi="Segoe UI Emoji" w:cs="Segoe UI Emoji"/>
+          <w:b/>
+          <w:bCs/>
+          <w:highlight w:val="yellow"/>
+        </w:rPr>
+      </w:pPr>
+      <w:r>
+        <w:rPr>
+          <w:rFonts w:ascii="Segoe UI Emoji" w:hAnsi="Segoe UI Emoji" w:cs="Segoe UI Emoji"/>
+          <w:b/>
+          <w:bCs/>
+          <w:highlight w:val="yellow"/>
+        </w:rPr>
+        <w:t>   - No calculations or business logic in UI</w:t>
+      </w:r>
+    </w:p>
+    <w:p>
+      <w:pPr>
+        <w:rPr>
+          <w:rFonts w:ascii="Segoe UI Emoji" w:hAnsi="Segoe UI Emoji" w:cs="Segoe UI Emoji"/>
+          <w:b/>
+          <w:bCs/>
+          <w:highlight w:val="yellow"/>
+        </w:rPr>
+      </w:pPr>
+    </w:p>
+    <w:p>
+      <w:pPr>
+        <w:rPr>
+          <w:rFonts w:ascii="Segoe UI Emoji" w:hAnsi="Segoe UI Emoji" w:cs="Segoe UI Emoji"/>
+          <w:b/>
+          <w:bCs/>
+          <w:highlight w:val="yellow"/>
+        </w:rPr>
+      </w:pPr>
+      <w:r>
+        <w:rPr>
+          <w:rFonts w:ascii="Segoe UI Emoji" w:hAnsi="Segoe UI Emoji" w:cs="Segoe UI Emoji"/>
+          <w:b/>
+          <w:bCs/>
+          <w:highlight w:val="yellow"/>
+        </w:rPr>
+        <w:t>4. Workflow Approval Actions</w:t>
+      </w:r>
+    </w:p>
+    <w:p>
+      <w:pPr>
+        <w:rPr>
+          <w:rFonts w:ascii="Segoe UI Emoji" w:hAnsi="Segoe UI Emoji" w:cs="Segoe UI Emoji"/>
+          <w:b/>
+          <w:bCs/>
+          <w:highlight w:val="yellow"/>
+        </w:rPr>
+      </w:pPr>
+      <w:r>
+        <w:rPr>
+          <w:rFonts w:ascii="Segoe UI Emoji" w:hAnsi="Segoe UI Emoji" w:cs="Segoe UI Emoji"/>
+          <w:b/>
+          <w:bCs/>
+          <w:highlight w:val="yellow"/>
+        </w:rPr>
+        <w:t>   - Action buttons that only trigger existing workflow API endpoints</w:t>
+      </w:r>
+    </w:p>
+    <w:p>
+      <w:pPr>
+        <w:rPr>
+          <w:rFonts w:ascii="Segoe UI Emoji" w:hAnsi="Segoe UI Emoji" w:cs="Segoe UI Emoji"/>
+          <w:b/>
+          <w:bCs/>
+          <w:highlight w:val="yellow"/>
+        </w:rPr>
+      </w:pPr>
+      <w:r>
+        <w:rPr>
+          <w:rFonts w:ascii="Segoe UI Emoji" w:hAnsi="Segoe UI Emoji" w:cs="Segoe UI Emoji"/>
+          <w:b/>
+          <w:bCs/>
+          <w:highlight w:val="yellow"/>
+        </w:rPr>
+        <w:t>   - Visibility controlled by backend RBAC (UI hides actions if not authorized)</w:t>
+      </w:r>
+    </w:p>
+    <w:p>
+      <w:pPr>
+        <w:rPr>
+          <w:rFonts w:ascii="Segoe UI Emoji" w:hAnsi="Segoe UI Emoji" w:cs="Segoe UI Emoji"/>
+          <w:b/>
+          <w:bCs/>
+          <w:highlight w:val="yellow"/>
+        </w:rPr>
+      </w:pPr>
+    </w:p>
+    <w:p>
+      <w:pPr>
+        <w:rPr>
+          <w:rFonts w:ascii="Segoe UI Emoji" w:hAnsi="Segoe UI Emoji" w:cs="Segoe UI Emoji"/>
+          <w:b/>
+          <w:bCs/>
+          <w:highlight w:val="yellow"/>
+        </w:rPr>
+      </w:pPr>
+      <w:r>
+        <w:rPr>
+          <w:rFonts w:ascii="Segoe UI Emoji" w:hAnsi="Segoe UI Emoji" w:cs="Segoe UI Emoji"/>
+          <w:b/>
+          <w:bCs/>
+          <w:highlight w:val="yellow"/>
+        </w:rPr>
+        <w:t>5. Status History</w:t>
+      </w:r>
+    </w:p>
+    <w:p>
+      <w:pPr>
+        <w:rPr>
+          <w:rFonts w:ascii="Segoe UI Emoji" w:hAnsi="Segoe UI Emoji" w:cs="Segoe UI Emoji"/>
+          <w:b/>
+          <w:bCs/>
+          <w:highlight w:val="yellow"/>
+        </w:rPr>
+      </w:pPr>
+      <w:r>
+        <w:rPr>
+          <w:rFonts w:ascii="Segoe UI Emoji" w:hAnsi="Segoe UI Emoji" w:cs="Segoe UI Emoji"/>
+          <w:b/>
+          <w:bCs/>
+          <w:highlight w:val="yellow"/>
+        </w:rPr>
+        <w:t>   - Read-only chronological timeline</w:t>
+      </w:r>
+    </w:p>
+    <w:p>
+      <w:pPr>
+        <w:rPr>
+          <w:rFonts w:ascii="Segoe UI Emoji" w:hAnsi="Segoe UI Emoji" w:cs="Segoe UI Emoji"/>
+          <w:b/>
+          <w:bCs/>
+          <w:highlight w:val="yellow"/>
+        </w:rPr>
+      </w:pPr>
+    </w:p>
+    <w:p>
+      <w:pPr>
+        <w:rPr>
+          <w:rFonts w:ascii="Segoe UI Emoji" w:hAnsi="Segoe UI Emoji" w:cs="Segoe UI Emoji"/>
+          <w:b/>
+          <w:bCs/>
+          <w:highlight w:val="yellow"/>
+        </w:rPr>
+      </w:pPr>
+      <w:r>
+        <w:rPr>
+          <w:rFonts w:ascii="Segoe UI Emoji" w:hAnsi="Segoe UI Emoji" w:cs="Segoe UI Emoji"/>
+          <w:b/>
+          <w:bCs/>
+          <w:highlight w:val="yellow"/>
+        </w:rPr>
+        <w:t>Notes:</w:t>
+      </w:r>
+    </w:p>
+    <w:p>
+      <w:pPr>
+        <w:rPr>
+          <w:rFonts w:ascii="Segoe UI Emoji" w:hAnsi="Segoe UI Emoji" w:cs="Segoe UI Emoji"/>
+          <w:b/>
+          <w:bCs/>
+          <w:highlight w:val="yellow"/>
+        </w:rPr>
+      </w:pPr>
+      <w:r>
+        <w:rPr>
+          <w:rFonts w:ascii="Segoe UI Emoji" w:hAnsi="Segoe UI Emoji" w:cs="Segoe UI Emoji"/>
+          <w:b/>
+          <w:bCs/>
+          <w:highlight w:val="yellow"/>
+        </w:rPr>
+        <w:t>- Reuse existing components</w:t>
+      </w:r>
+    </w:p>
+    <w:p>
+      <w:pPr>
+        <w:rPr>
+          <w:rFonts w:ascii="Segoe UI Emoji" w:hAnsi="Segoe UI Emoji" w:cs="Segoe UI Emoji"/>
+          <w:b/>
+          <w:bCs/>
+        </w:rPr>
+      </w:pPr>
+      <w:r>
+        <w:rPr>
+          <w:rFonts w:ascii="Segoe UI Emoji" w:hAnsi="Segoe UI Emoji" w:cs="Segoe UI Emoji"/>
+          <w:b/>
+          <w:bCs/>
+          <w:highlight w:val="yellow"/>
+        </w:rPr>
+        <w:t>- No architectural or state-management changes</w:t>
+      </w:r>
+    </w:p>
+    <w:p>
+      <w:pPr>
+        <w:rPr>
+          <w:b/>
+          <w:bCs/>
+        </w:rPr>
+      </w:pPr>
+      <w:r>
+        <w:rPr>
+          <w:b/>
+          <w:bCs/>
+        </w:rPr>
+        <w:lastRenderedPageBreak/>
+        <w:pict w14:anchorId="591427A6">
+          <v:rect id="_x0000_i1038" style="width:0;height:1.5pt" o:hralign="center" o:hrstd="t" o:hr="t" fillcolor="#a0a0a0" stroked="f"/>
+        </w:pict>
+      </w:r>
+    </w:p>
+    <w:p>
+      <w:pPr>
+        <w:rPr>
+          <w:b/>
+          <w:bCs/>
+        </w:rPr>
+      </w:pPr>
+      <w:r>
+        <w:rPr>
+          <w:b/>
+          <w:bCs/>
+        </w:rPr>
+        <w:t>PROMPT 18 — WORKFLOW &amp; APPROVAL UI (Inbox)</w:t>
+      </w:r>
+    </w:p>
+    <w:p>
+      <w:pPr>
+        <w:rPr>
+          <w:highlight w:val="yellow"/>
+        </w:rPr>
+      </w:pPr>
+      <w:r>
+        <w:rPr>
+          <w:highlight w:val="yellow"/>
+        </w:rPr>
+        <w:t>Build a Workflow &amp; Approvals Inbox UI for QEGPMO using existing UI framework and routing.</w:t>
+      </w:r>
+    </w:p>
+    <w:p>
+      <w:pPr>
+        <w:rPr>
+          <w:highlight w:val="yellow"/>
+        </w:rPr>
+      </w:pPr>
+    </w:p>
+    <w:p>
+      <w:pPr>
+        <w:rPr>
+          <w:highlight w:val="yellow"/>
+        </w:rPr>
+      </w:pPr>
+      <w:r>
+        <w:rPr>
+          <w:highlight w:val="yellow"/>
+        </w:rPr>
+        <w:t>Scope and constraints:</w:t>
+      </w:r>
+    </w:p>
+    <w:p>
+      <w:pPr>
+        <w:rPr>
+          <w:highlight w:val="yellow"/>
+        </w:rPr>
+      </w:pPr>
+      <w:r>
+        <w:rPr>
+          <w:highlight w:val="yellow"/>
+        </w:rPr>
+        <w:t>- UI only</w:t>
+      </w:r>
+    </w:p>
+    <w:p>
+      <w:pPr>
+        <w:rPr>
+          <w:highlight w:val="yellow"/>
+        </w:rPr>
+      </w:pPr>
+      <w:r>
+        <w:rPr>
+          <w:highlight w:val="yellow"/>
+        </w:rPr>
+        <w:t>- Assume workflow and approval APIs already exist</w:t>
+      </w:r>
+    </w:p>
+    <w:p>
+      <w:pPr>
+        <w:rPr>
+          <w:highlight w:val="yellow"/>
+        </w:rPr>
+      </w:pPr>
+      <w:r>
+        <w:rPr>
+          <w:highlight w:val="yellow"/>
+        </w:rPr>
+        <w:t>- Do NOT modify workflow logic, SLA rules, or authorization rules</w:t>
+      </w:r>
+    </w:p>
+    <w:p>
+      <w:pPr>
+        <w:rPr>
+          <w:highlight w:val="yellow"/>
+        </w:rPr>
+      </w:pPr>
+      <w:r>
+        <w:rPr>
+          <w:highlight w:val="yellow"/>
+        </w:rPr>
+        <w:t>- Keep UI strictly read-and-trigger</w:t>
+      </w:r>
+    </w:p>
+    <w:p>
+      <w:pPr>
+        <w:rPr>
+          <w:highlight w:val="yellow"/>
+        </w:rPr>
+      </w:pPr>
+    </w:p>
+    <w:p>
+      <w:pPr>
+        <w:rPr>
+          <w:highlight w:val="yellow"/>
+        </w:rPr>
+      </w:pPr>
+      <w:r>
+        <w:rPr>
+          <w:highlight w:val="yellow"/>
+        </w:rPr>
+        <w:t>Features:</w:t>
+      </w:r>
+    </w:p>
+    <w:p>
+      <w:pPr>
+        <w:rPr>
+          <w:highlight w:val="yellow"/>
+        </w:rPr>
+      </w:pPr>
+      <w:r>
+        <w:rPr>
+          <w:highlight w:val="yellow"/>
+        </w:rPr>
+        <w:t>- Pending approvals list (assigned to current user)</w:t>
+      </w:r>
+    </w:p>
+    <w:p>
+      <w:pPr>
+        <w:rPr>
+          <w:highlight w:val="yellow"/>
+        </w:rPr>
+      </w:pPr>
+      <w:r>
+        <w:rPr>
+          <w:highlight w:val="yellow"/>
+        </w:rPr>
+        <w:t>- Approval details read-only view</w:t>
+      </w:r>
+    </w:p>
+    <w:p>
+      <w:pPr>
+        <w:rPr>
+          <w:highlight w:val="yellow"/>
+        </w:rPr>
+      </w:pPr>
+      <w:r>
+        <w:rPr>
+          <w:highlight w:val="yellow"/>
+        </w:rPr>
+        <w:t>- Approve / Reject buttons that only call existing workflow APIs</w:t>
+      </w:r>
+    </w:p>
+    <w:p>
+      <w:pPr>
+        <w:rPr>
+          <w:highlight w:val="yellow"/>
+        </w:rPr>
+      </w:pPr>
+      <w:r>
+        <w:rPr>
+          <w:highlight w:val="yellow"/>
+        </w:rPr>
+        <w:t>- SLA indicators (display-only, based on API fields)</w:t>
+      </w:r>
+    </w:p>
+    <w:p>
+      <w:pPr>
+        <w:rPr>
+          <w:highlight w:val="yellow"/>
+        </w:rPr>
+      </w:pPr>
+      <w:r>
+        <w:rPr>
+          <w:highlight w:val="yellow"/>
+        </w:rPr>
+        <w:t>- Historical approvals view (read-only)</w:t>
+      </w:r>
+    </w:p>
+    <w:p>
+      <w:pPr>
+        <w:rPr>
+          <w:highlight w:val="yellow"/>
+        </w:rPr>
+      </w:pPr>
+    </w:p>
+    <w:p>
+      <w:pPr>
+        <w:rPr>
+          <w:highlight w:val="yellow"/>
+        </w:rPr>
+      </w:pPr>
+      <w:r>
+        <w:rPr>
+          <w:highlight w:val="yellow"/>
+        </w:rPr>
+        <w:t>Notes:</w:t>
+      </w:r>
+    </w:p>
+    <w:p>
+      <w:pPr>
+        <w:rPr>
+          <w:highlight w:val="yellow"/>
+        </w:rPr>
+      </w:pPr>
+      <w:r>
+        <w:rPr>
+          <w:highlight w:val="yellow"/>
+        </w:rPr>
+        <w:t>- Reuse existing components</w:t>
+      </w:r>
+    </w:p>
+    <w:p>
+      <w:r>
+        <w:rPr>
+          <w:highlight w:val="yellow"/>
+        </w:rPr>
+        <w:t>- No backend logic, validations, or workflow decisions in UI</w:t>
+      </w:r>
+    </w:p>
+    <w:p>
+      <w:pPr>
+        <w:rPr>
+          <w:b/>
+          <w:bCs/>
+        </w:rPr>
+      </w:pPr>
+      <w:r>
+        <w:rPr>
+          <w:b/>
+          <w:bCs/>
+        </w:rPr>
+        <w:t>PROMPT 19 — AI WEEKLY STATUS REPORT UI</w:t>
+      </w:r>
+    </w:p>
+    <w:p>
+      <w:r>
+        <w:t>Build UI pages for AI Weekly Status Reports using existing UI framework.</w:t>
+      </w:r>
+    </w:p>
     <w:p/>
     <w:p>
       <w:r>
-        <w:t>5. Historical Snapshots</w:t>
-      </w:r>
-    </w:p>
-    <w:p>
-      <w:r>
-        <w:t>- Display of historical budget and forecast snapshots</w:t>
-      </w:r>
-    </w:p>
-    <w:p>
-      <w:r>
-        <w:t>- Trend visualization over time</w:t>
-      </w:r>
-      <w:r>
-        <w:pict w14:anchorId="0B9258D2">
-          <v:rect id="_x0000_i1128" style="width:0;height:1.5pt" o:hralign="center" o:hrstd="t" o:hr="t" fillcolor="#a0a0a0" stroked="f"/>
-        </w:pict>
-      </w:r>
-    </w:p>
-    <w:p>
-      <w:pPr>
-        <w:rPr>
-          <w:b/>
-          <w:bCs/>
-        </w:rPr>
-      </w:pPr>
-      <w:r>
-        <w:rPr>
-          <w:rFonts w:ascii="Segoe UI Emoji" w:hAnsi="Segoe UI Emoji" w:cs="Segoe UI Emoji"/>
-          <w:b/>
-          <w:bCs/>
-        </w:rPr>
-        <w:t>🔹</w:t>
-      </w:r>
-      <w:r>
-        <w:rPr>
-          <w:b/>
-          <w:bCs/>
-        </w:rPr>
-        <w:t xml:space="preserve"> PROMPT 16 — RISK &amp; ISSUE MANAGEMENT UI</w:t>
-      </w:r>
-    </w:p>
-    <w:p>
-      <w:r>
-        <w:t>Build FULL UI pages for Risk and Issue Management.</w:t>
+        <w:t>Scope and constraints:</w:t>
+      </w:r>
+    </w:p>
+    <w:p>
+      <w:r>
+        <w:t>- UI only</w:t>
+      </w:r>
+    </w:p>
+    <w:p>
+      <w:r>
+        <w:lastRenderedPageBreak/>
+        <w:t>- All AI generation, logic, and content come from backend services</w:t>
+      </w:r>
+    </w:p>
+    <w:p>
+      <w:r>
+        <w:t>- Do NOT implement AI prompts or logic in UI</w:t>
+      </w:r>
+    </w:p>
+    <w:p>
+      <w:r>
+        <w:t>- Do NOT modify publishing workflows</w:t>
       </w:r>
     </w:p>
     <w:p/>
     <w:p>
       <w:r>
-        <w:t>Include:</w:t>
-      </w:r>
-    </w:p>
-    <w:p>
-      <w:r>
-        <w:t>- Risk register</w:t>
-      </w:r>
-    </w:p>
-    <w:p>
-      <w:r>
-        <w:t>- Issue register</w:t>
-      </w:r>
-    </w:p>
-    <w:p>
-      <w:r>
-        <w:t>- Severity visualization</w:t>
-      </w:r>
-    </w:p>
-    <w:p>
-      <w:r>
-        <w:t>- Aging indicators</w:t>
-      </w:r>
-    </w:p>
-    <w:p>
-      <w:r>
-        <w:t>- Risk &amp; issue details pages</w:t>
-      </w:r>
-    </w:p>
-    <w:p>
-      <w:r>
-        <w:t>- Escalation indicators</w:t>
-      </w:r>
-    </w:p>
-    <w:p>
-      <w:r>
-        <w:t>- Approval actions via Workflow Engine</w:t>
-      </w:r>
-    </w:p>
-    <w:p>
-      <w:r>
-        <w:pict w14:anchorId="08661934">
-          <v:rect id="_x0000_i1129" style="width:0;height:1.5pt" o:hralign="center" o:hrstd="t" o:hr="t" fillcolor="#a0a0a0" stroked="f"/>
-        </w:pict>
-      </w:r>
-    </w:p>
-    <w:p>
-      <w:pPr>
-        <w:rPr>
-          <w:b/>
-          <w:bCs/>
-        </w:rPr>
-      </w:pPr>
-      <w:r>
-        <w:rPr>
-          <w:rFonts w:ascii="Segoe UI Emoji" w:hAnsi="Segoe UI Emoji" w:cs="Segoe UI Emoji"/>
-          <w:b/>
-          <w:bCs/>
-        </w:rPr>
-        <w:t>🔹</w:t>
-      </w:r>
-      <w:r>
-        <w:rPr>
-          <w:b/>
-          <w:bCs/>
-        </w:rPr>
-        <w:t xml:space="preserve"> PROMPT 17 — CHANGE MANAGEMENT UI</w:t>
-      </w:r>
-    </w:p>
-    <w:p>
-      <w:r>
-        <w:t>Build FULL UI pages for Change Management.</w:t>
+        <w:t>Features:</w:t>
+      </w:r>
+    </w:p>
+    <w:p>
+      <w:r>
+        <w:t>- Generate Weekly Report button (triggers backend API)</w:t>
+      </w:r>
+    </w:p>
+    <w:p>
+      <w:r>
+        <w:t>- Editable report view (text only)</w:t>
+      </w:r>
+    </w:p>
+    <w:p>
+      <w:r>
+        <w:t>- Publish action (calls existing workflow API)</w:t>
+      </w:r>
+    </w:p>
+    <w:p>
+      <w:r>
+        <w:t>- Version history (read-only)</w:t>
+      </w:r>
+    </w:p>
+    <w:p>
+      <w:r>
+        <w:t>- Export buttons for Excel / PDF / PPT (trigger existing export APIs)</w:t>
       </w:r>
     </w:p>
     <w:p/>
     <w:p>
       <w:r>
-        <w:t>Include:</w:t>
-      </w:r>
-    </w:p>
-    <w:p>
-      <w:r>
-        <w:t>- Change request list</w:t>
-      </w:r>
-    </w:p>
-    <w:p>
-      <w:r>
-        <w:t>- Change details page</w:t>
-      </w:r>
-    </w:p>
-    <w:p>
-      <w:r>
-        <w:t>- Impact analysis view (scope, schedule, cost, resources)</w:t>
+        <w:t>Notes:</w:t>
+      </w:r>
+    </w:p>
+    <w:p>
+      <w:r>
+        <w:t>- UI acts as orchestration layer only</w:t>
+      </w:r>
+    </w:p>
+    <w:p>
+      <w:r>
+        <w:t>- No AI or business logic in UI</w:t>
+      </w:r>
+    </w:p>
+    <w:p>
+      <w:pPr>
+        <w:rPr>
+          <w:b/>
+          <w:bCs/>
+        </w:rPr>
+      </w:pPr>
+      <w:r>
+        <w:rPr>
+          <w:b/>
+          <w:bCs/>
+        </w:rPr>
+        <w:t>PROMPT 20 — AI RISK DETECTION UI</w:t>
+      </w:r>
+    </w:p>
+    <w:p>
+      <w:r>
+        <w:t>Build UI pages for AI-assisted Risk Detection using existing UI framework.</w:t>
+      </w:r>
+    </w:p>
+    <w:p/>
+    <w:p>
+      <w:r>
+        <w:t>Scope and constraints:</w:t>
+      </w:r>
+    </w:p>
+    <w:p>
+      <w:r>
+        <w:t>- UI only</w:t>
+      </w:r>
+    </w:p>
+    <w:p>
+      <w:r>
+        <w:t>- All AI logic and confidence scoring come from backend</w:t>
+      </w:r>
+    </w:p>
+    <w:p>
+      <w:r>
+        <w:t>- No automatic publishing</w:t>
+      </w:r>
+    </w:p>
+    <w:p>
+      <w:r>
+        <w:t>- Do NOT modify risk registers logic</w:t>
+      </w:r>
+    </w:p>
+    <w:p/>
+    <w:p>
+      <w:r>
+        <w:t>Features:</w:t>
+      </w:r>
+    </w:p>
+    <w:p>
+      <w:r>
+        <w:t>- Suggested Risks list (read-only data from API)</w:t>
+      </w:r>
+    </w:p>
+    <w:p>
+      <w:r>
+        <w:t>- Confidence indicator (visual only)</w:t>
       </w:r>
     </w:p>
     <w:p>
       <w:r>
         <w:lastRenderedPageBreak/>
-        <w:t>- Workflow approval actions</w:t>
-      </w:r>
-    </w:p>
-    <w:p>
-      <w:r>
-        <w:t>- Status history</w:t>
+        <w:t>- Explanation view (AI-provided text only)</w:t>
+      </w:r>
+    </w:p>
+    <w:p>
+      <w:r>
+        <w:t>- Approve / Reject buttons that call backend endpoints</w:t>
+      </w:r>
+    </w:p>
+    <w:p>
+      <w:r>
+        <w:t xml:space="preserve">- </w:t>
+      </w:r>
+      <w:proofErr w:type="gramStart"/>
+      <w:r>
+        <w:t>Manual</w:t>
+      </w:r>
+      <w:proofErr w:type="gramEnd"/>
+      <w:r>
+        <w:t xml:space="preserve"> publish action to main risk register via existing API</w:t>
       </w:r>
     </w:p>
     <w:p/>
     <w:p>
       <w:r>
-        <w:t>RBAC must enforce who can submit and approve.</w:t>
-      </w:r>
-    </w:p>
-    <w:p>
-      <w:r>
-        <w:pict w14:anchorId="4FE19A1C">
-          <v:rect id="_x0000_i1130" style="width:0;height:1.5pt" o:hralign="center" o:hrstd="t" o:hr="t" fillcolor="#a0a0a0" stroked="f"/>
-        </w:pict>
-      </w:r>
-    </w:p>
-    <w:p>
-      <w:pPr>
-        <w:rPr>
-          <w:b/>
-          <w:bCs/>
-        </w:rPr>
-      </w:pPr>
-      <w:r>
-        <w:rPr>
-          <w:rFonts w:ascii="Segoe UI Emoji" w:hAnsi="Segoe UI Emoji" w:cs="Segoe UI Emoji"/>
-          <w:b/>
-          <w:bCs/>
-        </w:rPr>
-        <w:t>🔹</w:t>
-      </w:r>
-      <w:r>
-        <w:rPr>
-          <w:b/>
-          <w:bCs/>
-        </w:rPr>
-        <w:t xml:space="preserve"> PROMPT 18 — WORKFLOW &amp; APPROVAL UI (Inbox)</w:t>
-      </w:r>
-    </w:p>
-    <w:p>
-      <w:r>
-        <w:t>Build a Workflow &amp; Approvals UI inbox for QEGPMO.</w:t>
+        <w:t>Notes:</w:t>
+      </w:r>
+    </w:p>
+    <w:p>
+      <w:r>
+        <w:t>- UI does not decide or assess risk</w:t>
+      </w:r>
+    </w:p>
+    <w:p>
+      <w:r>
+        <w:t>- Backend controls final publish behavior</w:t>
+      </w:r>
+    </w:p>
+    <w:p>
+      <w:pPr>
+        <w:rPr>
+          <w:b/>
+          <w:bCs/>
+        </w:rPr>
+      </w:pPr>
+      <w:r>
+        <w:rPr>
+          <w:b/>
+          <w:bCs/>
+        </w:rPr>
+        <w:t>PROMPT 20 — AI RISK DETECTION UI</w:t>
+      </w:r>
+    </w:p>
+    <w:p>
+      <w:r>
+        <w:t>Build UI pages for AI-assisted Risk Detection using existing UI framework.</w:t>
       </w:r>
     </w:p>
     <w:p/>
     <w:p>
       <w:r>
-        <w:t>Include:</w:t>
-      </w:r>
-    </w:p>
-    <w:p>
-      <w:r>
-        <w:t>- Pending approvals list</w:t>
-      </w:r>
-    </w:p>
-    <w:p>
-      <w:r>
-        <w:t xml:space="preserve">- Approval </w:t>
+        <w:t>Scope and constraints:</w:t>
+      </w:r>
+    </w:p>
+    <w:p>
+      <w:r>
+        <w:t>- UI only</w:t>
+      </w:r>
+    </w:p>
+    <w:p>
+      <w:r>
+        <w:t>- All AI logic and confidence scoring come from backend</w:t>
+      </w:r>
+    </w:p>
+    <w:p>
+      <w:r>
+        <w:t>- No automatic publishing</w:t>
+      </w:r>
+    </w:p>
+    <w:p>
+      <w:r>
+        <w:t>- Do NOT modify risk registers logic</w:t>
+      </w:r>
+    </w:p>
+    <w:p/>
+    <w:p>
+      <w:r>
+        <w:t>Features:</w:t>
+      </w:r>
+    </w:p>
+    <w:p>
+      <w:r>
+        <w:t>- Suggested Risks list (read-only data from API)</w:t>
+      </w:r>
+    </w:p>
+    <w:p>
+      <w:r>
+        <w:t>- Confidence indicator (visual only)</w:t>
+      </w:r>
+    </w:p>
+    <w:p>
+      <w:r>
+        <w:t>- Explanation view (AI-provided text only)</w:t>
+      </w:r>
+    </w:p>
+    <w:p>
+      <w:r>
+        <w:t>- Approve / Reject buttons that call backend endpoints</w:t>
+      </w:r>
+    </w:p>
+    <w:p>
+      <w:r>
+        <w:t xml:space="preserve">- </w:t>
       </w:r>
       <w:proofErr w:type="gramStart"/>
       <w:r>
-        <w:t>details view</w:t>
+        <w:t>Manual</w:t>
       </w:r>
       <w:proofErr w:type="gramEnd"/>
-    </w:p>
-    <w:p>
-      <w:r>
-        <w:t>- Approve / Reject actions</w:t>
-      </w:r>
-    </w:p>
-    <w:p>
-      <w:r>
-        <w:t>- SLA indicators</w:t>
-      </w:r>
-    </w:p>
-    <w:p>
-      <w:r>
-        <w:t>- Historical approvals view</w:t>
+      <w:r>
+        <w:t xml:space="preserve"> publish action to main risk register via existing API</w:t>
       </w:r>
     </w:p>
     <w:p/>
     <w:p>
       <w:r>
-        <w:t>Must integrate with Workflow Engine APIs.</w:t>
-      </w:r>
-    </w:p>
-    <w:p>
-      <w:r>
-        <w:pict w14:anchorId="1CE2032F">
-          <v:rect id="_x0000_i1131" style="width:0;height:1.5pt" o:hralign="center" o:hrstd="t" o:hr="t" fillcolor="#a0a0a0" stroked="f"/>
-        </w:pict>
-      </w:r>
-    </w:p>
-    <w:p>
-      <w:pPr>
-        <w:rPr>
-          <w:b/>
-          <w:bCs/>
-        </w:rPr>
-      </w:pPr>
-      <w:r>
-        <w:rPr>
-          <w:rFonts w:ascii="Segoe UI Emoji" w:hAnsi="Segoe UI Emoji" w:cs="Segoe UI Emoji"/>
-          <w:b/>
-          <w:bCs/>
-        </w:rPr>
-        <w:t>🔹</w:t>
-      </w:r>
-      <w:r>
-        <w:rPr>
-          <w:b/>
-          <w:bCs/>
-        </w:rPr>
-        <w:t xml:space="preserve"> PROMPT 19 — AI WEEKLY STATUS REPORT UI</w:t>
-      </w:r>
-    </w:p>
-    <w:p>
-      <w:r>
-        <w:t>Build UI pages for AI Weekly Status Reports.</w:t>
+        <w:t>Notes:</w:t>
+      </w:r>
+    </w:p>
+    <w:p>
+      <w:r>
+        <w:t>- UI does not decide or assess risk</w:t>
+      </w:r>
+    </w:p>
+    <w:p>
+      <w:r>
+        <w:t>- Backend controls final publish behavior</w:t>
+      </w:r>
+    </w:p>
+    <w:p>
+      <w:pPr>
+        <w:rPr>
+          <w:b/>
+          <w:bCs/>
+        </w:rPr>
+      </w:pPr>
+      <w:r>
+        <w:rPr>
+          <w:b/>
+          <w:bCs/>
+        </w:rPr>
+        <w:lastRenderedPageBreak/>
+        <w:t>PROMPT 21 — REPORTING &amp; EXPORT UI</w:t>
+      </w:r>
+    </w:p>
+    <w:p>
+      <w:r>
+        <w:t>Build Reporting &amp; Export UI pages for QEGPMO using existing UI framework.</w:t>
       </w:r>
     </w:p>
     <w:p/>
     <w:p>
       <w:r>
-        <w:t>Include:</w:t>
-      </w:r>
-    </w:p>
-    <w:p>
-      <w:r>
-        <w:t>- Generate weekly report button</w:t>
-      </w:r>
-    </w:p>
-    <w:p>
-      <w:r>
-        <w:t>- Editable AI-generated report view</w:t>
-      </w:r>
-    </w:p>
-    <w:p>
-      <w:r>
-        <w:t>- Publish workflow</w:t>
-      </w:r>
-    </w:p>
-    <w:p>
-      <w:r>
-        <w:t>- Version history</w:t>
-      </w:r>
-    </w:p>
-    <w:p>
-      <w:r>
-        <w:t>- Export to Excel / PDF / PPT</w:t>
+        <w:t>Scope and constraints:</w:t>
+      </w:r>
+    </w:p>
+    <w:p>
+      <w:r>
+        <w:t>- UI only</w:t>
+      </w:r>
+    </w:p>
+    <w:p>
+      <w:r>
+        <w:t>- All report data must come from backend roll-up APIs</w:t>
+      </w:r>
+    </w:p>
+    <w:p>
+      <w:r>
+        <w:t>- No calculations or aggregations in UI</w:t>
+      </w:r>
+    </w:p>
+    <w:p>
+      <w:r>
+        <w:t>- No custom joins or summaries</w:t>
       </w:r>
     </w:p>
     <w:p/>
     <w:p>
       <w:r>
-        <w:t>AI logic must come from backend services only.</w:t>
-      </w:r>
-    </w:p>
-    <w:p>
-      <w:r>
-        <w:t>``</w:t>
-      </w:r>
-    </w:p>
-    <w:p>
-      <w:r>
-        <w:pict w14:anchorId="25A0E1D7">
-          <v:rect id="_x0000_i1132" style="width:0;height:1.5pt" o:hralign="center" o:hrstd="t" o:hr="t" fillcolor="#a0a0a0" stroked="f"/>
-        </w:pict>
-      </w:r>
-    </w:p>
-    <w:p>
-      <w:pPr>
-        <w:rPr>
-          <w:b/>
-          <w:bCs/>
-        </w:rPr>
-      </w:pPr>
-      <w:r>
-        <w:rPr>
-          <w:rFonts w:ascii="Segoe UI Emoji" w:hAnsi="Segoe UI Emoji" w:cs="Segoe UI Emoji"/>
-          <w:b/>
-          <w:bCs/>
-        </w:rPr>
-        <w:t>🔹</w:t>
-      </w:r>
-      <w:r>
-        <w:rPr>
-          <w:b/>
-          <w:bCs/>
-        </w:rPr>
-        <w:t xml:space="preserve"> PROMPT 20 — AI RISK DETECTION UI</w:t>
-      </w:r>
-    </w:p>
-    <w:p>
-      <w:r>
-        <w:t>Build UI pages for AI-assisted Risk Detection.</w:t>
+        <w:t>Features:</w:t>
+      </w:r>
+    </w:p>
+    <w:p>
+      <w:r>
+        <w:t>- Portfolio reports</w:t>
+      </w:r>
+    </w:p>
+    <w:p>
+      <w:r>
+        <w:t>- Program reports</w:t>
+      </w:r>
+    </w:p>
+    <w:p>
+      <w:r>
+        <w:t>- Project reports</w:t>
+      </w:r>
+    </w:p>
+    <w:p>
+      <w:r>
+        <w:t>- Filters and parameters (pass-through to APIs)</w:t>
+      </w:r>
+    </w:p>
+    <w:p>
+      <w:r>
+        <w:t>- Excel export for all views (trigger backend export APIs)</w:t>
       </w:r>
     </w:p>
     <w:p/>
     <w:p>
       <w:r>
-        <w:t>Include:</w:t>
-      </w:r>
-    </w:p>
-    <w:p>
-      <w:r>
-        <w:t>- Suggested risks list</w:t>
-      </w:r>
-    </w:p>
-    <w:p>
-      <w:r>
-        <w:t>- Confidence indicators</w:t>
-      </w:r>
-    </w:p>
-    <w:p>
-      <w:r>
-        <w:t>- Explanation view (why risk detected)</w:t>
-      </w:r>
-    </w:p>
-    <w:p>
-      <w:r>
-        <w:t>- Approve / reject actions</w:t>
-      </w:r>
-    </w:p>
-    <w:p>
-      <w:r>
-        <w:t>- Risk publishing to main register</w:t>
+        <w:t>Notes:</w:t>
+      </w:r>
+    </w:p>
+    <w:p>
+      <w:r>
+        <w:t>- UI displays backend-prepared data only</w:t>
+      </w:r>
+    </w:p>
+    <w:p>
+      <w:r>
+        <w:t>- No reporting logic in UI</w:t>
       </w:r>
     </w:p>
     <w:p/>
-    <w:p>
-      <w:r>
-        <w:t>No automatic publishing allowed.</w:t>
-      </w:r>
-    </w:p>
-    <w:p>
-      <w:r>
-        <w:pict w14:anchorId="2804BEB0">
-          <v:rect id="_x0000_i1133" style="width:0;height:1.5pt" o:hralign="center" o:hrstd="t" o:hr="t" fillcolor="#a0a0a0" stroked="f"/>
-        </w:pict>
-      </w:r>
-    </w:p>
-    <w:p>
-      <w:pPr>
-        <w:rPr>
-          <w:b/>
-          <w:bCs/>
-        </w:rPr>
-      </w:pPr>
-      <w:r>
-        <w:rPr>
-          <w:rFonts w:ascii="Segoe UI Emoji" w:hAnsi="Segoe UI Emoji" w:cs="Segoe UI Emoji"/>
-          <w:b/>
-          <w:bCs/>
-        </w:rPr>
-        <w:t>🔹</w:t>
-      </w:r>
-      <w:r>
-        <w:rPr>
-          <w:b/>
-          <w:bCs/>
-        </w:rPr>
-        <w:t xml:space="preserve"> PROMPT 21 — REPORTING &amp; EXPORT UI</w:t>
-      </w:r>
-    </w:p>
-    <w:p>
-      <w:r>
-        <w:t>Build generic Reporting &amp; Export UI for QEGPMO.</w:t>
-      </w:r>
-    </w:p>
     <w:p/>
-    <w:p>
-      <w:r>
-        <w:t>Include:</w:t>
-      </w:r>
-    </w:p>
-    <w:p>
-      <w:r>
-        <w:t>- Portfolio reports</w:t>
-      </w:r>
-    </w:p>
-    <w:p>
-      <w:r>
-        <w:t>- Program reports</w:t>
-      </w:r>
-    </w:p>
-    <w:p>
-      <w:r>
-        <w:t>- Project reports</w:t>
-      </w:r>
-    </w:p>
-    <w:p>
-      <w:r>
-        <w:t>- Filters &amp; parameters</w:t>
-      </w:r>
-    </w:p>
-    <w:p>
-      <w:r>
-        <w:t>- Excel export for all views</w:t>
-      </w:r>
-    </w:p>
     <w:p/>
-    <w:p>
-      <w:r>
-        <w:lastRenderedPageBreak/>
-        <w:t>All data must come from backend roll-up APIs.</w:t>
-      </w:r>
-    </w:p>
-    <w:p>
-      <w:r>
-        <w:pict w14:anchorId="591427A6">
-          <v:rect id="_x0000_i1134" style="width:0;height:1.5pt" o:hralign="center" o:hrstd="t" o:hr="t" fillcolor="#a0a0a0" stroked="f"/>
-        </w:pict>
-      </w:r>
-    </w:p>
+    <w:p/>
     <w:p>
       <w:pPr>
         <w:rPr>
@@ -3645,6 +5160,7 @@
         <w:rPr>
           <w:rFonts w:ascii="Segoe UI Symbol" w:hAnsi="Segoe UI Symbol" w:cs="Segoe UI Symbol"/>
         </w:rPr>
+        <w:lastRenderedPageBreak/>
         <w:t>✔</w:t>
       </w:r>
       <w:r>
@@ -3772,7 +5288,7 @@
     <w:p>
       <w:r>
         <w:pict w14:anchorId="7541F09B">
-          <v:rect id="_x0000_i1135" style="width:0;height:1.5pt" o:hralign="center" o:hrstd="t" o:hr="t" fillcolor="#a0a0a0" stroked="f"/>
+          <v:rect id="_x0000_i1039" style="width:0;height:1.5pt" o:hralign="center" o:hrstd="t" o:hr="t" fillcolor="#a0a0a0" stroked="f"/>
         </w:pict>
       </w:r>
     </w:p>
@@ -3941,7 +5457,7 @@
     <w:p>
       <w:r>
         <w:pict w14:anchorId="7DB85A53">
-          <v:rect id="_x0000_i1136" style="width:0;height:1.5pt" o:hralign="center" o:hrstd="t" o:hr="t" fillcolor="#a0a0a0" stroked="f"/>
+          <v:rect id="_x0000_i1040" style="width:0;height:1.5pt" o:hralign="center" o:hrstd="t" o:hr="t" fillcolor="#a0a0a0" stroked="f"/>
         </w:pict>
       </w:r>
     </w:p>
@@ -4078,7 +5594,6 @@
         <w:rPr>
           <w:rtl/>
         </w:rPr>
-        <w:lastRenderedPageBreak/>
         <w:t>لو تحب</w:t>
       </w:r>
       <w:r>

</xml_diff>